<commit_message>
few final bits and pieces
</commit_message>
<xml_diff>
--- a/paper_drafts/response_to_reviewers.docx
+++ b/paper_drafts/response_to_reviewers.docx
@@ -28,15 +28,7 @@
     </w:p>
     <w:p>
       <w:r>
-        <w:t xml:space="preserve">Generally </w:t>
-      </w:r>
-      <w:proofErr w:type="gramStart"/>
-      <w:r>
-        <w:t>speaking</w:t>
-      </w:r>
-      <w:proofErr w:type="gramEnd"/>
-      <w:r>
-        <w:t xml:space="preserve"> I have been enthusiastic about the approach that this group uses and the modelling approach that they presented recently. They now provide a fine addition to their previous modelling. This is for sure a nice continuation of their work until now, that continues their previous work in a logical way.</w:t>
+        <w:t>Generally speaking I have been enthusiastic about the approach that this group uses and the modelling approach that they presented recently. They now provide a fine addition to their previous modelling. This is for sure a nice continuation of their work until now, that continues their previous work in a logical way.</w:t>
       </w:r>
       <w:r>
         <w:br/>
@@ -121,63 +113,25 @@
         <w:rPr>
           <w:color w:val="EE0000"/>
         </w:rPr>
-        <w:t xml:space="preserve">) that is attempting to apply a version of </w:t>
-      </w:r>
-      <w:proofErr w:type="spellStart"/>
-      <w:r>
-        <w:rPr>
-          <w:color w:val="EE0000"/>
-        </w:rPr>
-        <w:t>FoMo</w:t>
-      </w:r>
-      <w:proofErr w:type="spellEnd"/>
-      <w:r>
-        <w:rPr>
-          <w:color w:val="EE0000"/>
-        </w:rPr>
-        <w:t xml:space="preserve"> to a set-up fairly similar to the ‘serious game’ detailed in </w:t>
-      </w:r>
-      <w:proofErr w:type="spellStart"/>
-      <w:r>
-        <w:rPr>
-          <w:color w:val="EE0000"/>
-        </w:rPr>
-        <w:t>Prpic</w:t>
-      </w:r>
-      <w:proofErr w:type="spellEnd"/>
-      <w:r>
-        <w:rPr>
-          <w:color w:val="EE0000"/>
-        </w:rPr>
-        <w:t xml:space="preserve"> et al. We have now added a paragraph at the end of the discussion (L1186) that considers modelling real-world foraging as a future goal for </w:t>
-      </w:r>
-      <w:proofErr w:type="spellStart"/>
-      <w:r>
-        <w:rPr>
-          <w:color w:val="EE0000"/>
-        </w:rPr>
-        <w:t>FoMo</w:t>
-      </w:r>
-      <w:proofErr w:type="spellEnd"/>
-      <w:r>
-        <w:rPr>
-          <w:color w:val="EE0000"/>
-        </w:rPr>
-        <w:t>.</w:t>
-      </w:r>
-    </w:p>
-    <w:p>
-      <w:r>
-        <w:br/>
-        <w:t xml:space="preserve">One minor point but could be important is that the authors refer to summary statistics regarding previous treatment of foraging results. The term “summary statistics” is quite loaded in the literature on visual cognition. </w:t>
-      </w:r>
-      <w:proofErr w:type="gramStart"/>
-      <w:r>
-        <w:t>So</w:t>
-      </w:r>
-      <w:proofErr w:type="gramEnd"/>
-      <w:r>
-        <w:t xml:space="preserve"> I simply want to warn the authors that many people may think of how ensembles are summarized in perception when they hear this term.</w:t>
+        <w:t>) that is attempting to apply a version of FoMo to a set-up fairly similar to the ‘serious game’ detailed in Prpic et al. We have now added a paragraph at the end of the discussion (L1</w:t>
+      </w:r>
+      <w:r>
+        <w:rPr>
+          <w:color w:val="EE0000"/>
+        </w:rPr>
+        <w:t>210</w:t>
+      </w:r>
+      <w:r>
+        <w:rPr>
+          <w:color w:val="EE0000"/>
+        </w:rPr>
+        <w:t>) that considers modelling real-world foraging as a future goal for FoMo.</w:t>
+      </w:r>
+    </w:p>
+    <w:p>
+      <w:r>
+        <w:br/>
+        <w:t>One minor point but could be important is that the authors refer to summary statistics regarding previous treatment of foraging results. The term “summary statistics” is quite loaded in the literature on visual cognition. So I simply want to warn the authors that many people may think of how ensembles are summarized in perception when they hear this term.</w:t>
       </w:r>
     </w:p>
     <w:p>
@@ -206,53 +160,13 @@
     </w:p>
     <w:p>
       <w:r>
-        <w:t>I was invited to review the manuscript entitled “</w:t>
-      </w:r>
-      <w:proofErr w:type="spellStart"/>
-      <w:r>
-        <w:t>FoMo</w:t>
-      </w:r>
-      <w:proofErr w:type="spellEnd"/>
-      <w:r>
-        <w:t>: A Unifying Theory of Visual Foraging” for PLOS Computational Biology. Overall, I consider this to be a strong and timely contribution that will advance the study and understanding of visual foraging tasks within cognitive psychology and computational science. </w:t>
+        <w:t>I was invited to review the manuscript entitled “FoMo: A Unifying Theory of Visual Foraging” for PLOS Computational Biology. Overall, I consider this to be a strong and timely contribution that will advance the study and understanding of visual foraging tasks within cognitive psychology and computational science. </w:t>
       </w:r>
     </w:p>
     <w:p/>
     <w:p>
       <w:r>
-        <w:t xml:space="preserve">The manuscript proposes a unifying theoretical framework that integrates and extends prior approaches to visual foraging. Importantly, it introduces two additional parameters to the original </w:t>
-      </w:r>
-      <w:proofErr w:type="spellStart"/>
-      <w:r>
-        <w:t>FoMo</w:t>
-      </w:r>
-      <w:proofErr w:type="spellEnd"/>
-      <w:r>
-        <w:t xml:space="preserve"> model to account for spatial aspects that had not been explicitly considered in earlier versions. This extension is particularly relevant given that visual foraging experiments are typically conducted in two-dimensional spatial environments, where the structure and organization of space can meaningfully shape </w:t>
-      </w:r>
-      <w:proofErr w:type="spellStart"/>
-      <w:r>
-        <w:t>behavior</w:t>
-      </w:r>
-      <w:proofErr w:type="spellEnd"/>
-      <w:r>
-        <w:t xml:space="preserve">. The paper also appropriately acknowledges broader theoretical questions regarding when foragers decide to stop searching or leave a patch, a central issue historically associated with </w:t>
-      </w:r>
-      <w:proofErr w:type="spellStart"/>
-      <w:r>
-        <w:t>Charnov’s</w:t>
-      </w:r>
-      <w:proofErr w:type="spellEnd"/>
-      <w:r>
-        <w:t xml:space="preserve"> Marginal Value Theorem (MVT). While the present manuscript does not resolve ongoing debates about the applicability of MVT to human foraging, it recognizes this point as important and aligns well with recent work suggesting that spatial and organizational factors may be critical for understanding stop/leave decisions in humans. In this sense, incorporating spatial parameters into the </w:t>
-      </w:r>
-      <w:proofErr w:type="spellStart"/>
-      <w:r>
-        <w:t>FoMo</w:t>
-      </w:r>
-      <w:proofErr w:type="spellEnd"/>
-      <w:r>
-        <w:t xml:space="preserve"> framework represents a valuable step that may help guide future work on these questions, even if it does not fully settle them. </w:t>
+        <w:t>The manuscript proposes a unifying theoretical framework that integrates and extends prior approaches to visual foraging. Importantly, it introduces two additional parameters to the original FoMo model to account for spatial aspects that had not been explicitly considered in earlier versions. This extension is particularly relevant given that visual foraging experiments are typically conducted in two-dimensional spatial environments, where the structure and organization of space can meaningfully shape behavior. The paper also appropriately acknowledges broader theoretical questions regarding when foragers decide to stop searching or leave a patch, a central issue historically associated with Charnov’s Marginal Value Theorem (MVT). While the present manuscript does not resolve ongoing debates about the applicability of MVT to human foraging, it recognizes this point as important and aligns well with recent work suggesting that spatial and organizational factors may be critical for understanding stop/leave decisions in humans. In this sense, incorporating spatial parameters into the FoMo framework represents a valuable step that may help guide future work on these questions, even if it does not fully settle them. </w:t>
       </w:r>
     </w:p>
     <w:p/>
@@ -273,29 +187,13 @@
     <w:p/>
     <w:p>
       <w:r>
-        <w:t xml:space="preserve">Overall, I have little to criticize at a general level. I have no doubt that the manuscript is suitable for publication in PLOS Computational Biology. My comments are limited to a small number of minor issues, which I detail below; accordingly, my recommendation is minor revision, as the core contributions are solid and very </w:t>
-      </w:r>
-      <w:proofErr w:type="spellStart"/>
-      <w:r>
-        <w:t>well articulated</w:t>
-      </w:r>
-      <w:proofErr w:type="spellEnd"/>
-      <w:r>
-        <w:t>. </w:t>
+        <w:t>Overall, I have little to criticize at a general level. I have no doubt that the manuscript is suitable for publication in PLOS Computational Biology. My comments are limited to a small number of minor issues, which I detail below; accordingly, my recommendation is minor revision, as the core contributions are solid and very well articulated. </w:t>
       </w:r>
     </w:p>
     <w:p/>
     <w:p>
       <w:r>
-        <w:t xml:space="preserve">Below, I present </w:t>
-      </w:r>
-      <w:proofErr w:type="gramStart"/>
-      <w:r>
-        <w:t>a number of</w:t>
-      </w:r>
-      <w:proofErr w:type="gramEnd"/>
-      <w:r>
-        <w:t xml:space="preserve"> minor comments and suggestions intended to improve clarity and accessibility. For ease of review, these comments are organized following the structure of the manuscript, from the Introduction through the Discussion. This ordering is purely for convenience and does not reflect the relative importance of the points raised. One caveat is that the first two comments are more general in nature and therefore appear first, before the section-by-section remarks. </w:t>
+        <w:t>Below, I present a number of minor comments and suggestions intended to improve clarity and accessibility. For ease of review, these comments are organized following the structure of the manuscript, from the Introduction through the Discussion. This ordering is purely for convenience and does not reflect the relative importance of the points raised. One caveat is that the first two comments are more general in nature and therefore appear first, before the section-by-section remarks. </w:t>
       </w:r>
     </w:p>
     <w:p/>
@@ -306,31 +204,7 @@
     </w:p>
     <w:p>
       <w:r>
-        <w:t xml:space="preserve">Throughout the manuscript, the notation used in several formulas can be difficult to follow, particularly for readers who are less familiar with mathematical </w:t>
-      </w:r>
-      <w:proofErr w:type="spellStart"/>
-      <w:r>
-        <w:t>modeling</w:t>
-      </w:r>
-      <w:proofErr w:type="spellEnd"/>
-      <w:r>
-        <w:t xml:space="preserve">. While I understand that some definitions may have been omitted to improve readability, in several cases it is not clear what specific notations (e.g., r, </w:t>
-      </w:r>
-      <w:proofErr w:type="spellStart"/>
-      <w:r>
-        <w:t>i</w:t>
-      </w:r>
-      <w:proofErr w:type="spellEnd"/>
-      <w:r>
-        <w:t xml:space="preserve">, j, K, etc.) refer to. Sometimes these are explained, but at other times they are not, or the explanation appears earlier and is easy to miss. I believe the manuscript would benefit from a systematic revision of the equations to ensure that all parameters and symbols are explicitly defined at the point where they are introduced, for example using formulations such as: “where K denotes …, and j represents the number of iterations,” etc. This would greatly facilitate comprehension, especially for readers with a stronger theoretical than mathematical </w:t>
-      </w:r>
-      <w:proofErr w:type="gramStart"/>
-      <w:r>
-        <w:t>background, and</w:t>
-      </w:r>
-      <w:proofErr w:type="gramEnd"/>
-      <w:r>
-        <w:t xml:space="preserve"> would make the model more accessible overall. </w:t>
+        <w:t>Throughout the manuscript, the notation used in several formulas can be difficult to follow, particularly for readers who are less familiar with mathematical modeling. While I understand that some definitions may have been omitted to improve readability, in several cases it is not clear what specific notations (e.g., r, i, j, K, etc.) refer to. Sometimes these are explained, but at other times they are not, or the explanation appears earlier and is easy to miss. I believe the manuscript would benefit from a systematic revision of the equations to ensure that all parameters and symbols are explicitly defined at the point where they are introduced, for example using formulations such as: “where K denotes …, and j represents the number of iterations,” etc. This would greatly facilitate comprehension, especially for readers with a stronger theoretical than mathematical background, and would make the model more accessible overall. </w:t>
       </w:r>
     </w:p>
     <w:p/>
@@ -356,23 +230,7 @@
     </w:p>
     <w:p>
       <w:r>
-        <w:t xml:space="preserve">The manuscript states that the </w:t>
-      </w:r>
-      <w:proofErr w:type="spellStart"/>
-      <w:r>
-        <w:t>FoMo</w:t>
-      </w:r>
-      <w:proofErr w:type="spellEnd"/>
-      <w:r>
-        <w:t xml:space="preserve"> framework is intended to be clear and usable by the broader community; however, the complexity of the presentation may unintentionally discourage researchers from </w:t>
-      </w:r>
-      <w:proofErr w:type="gramStart"/>
-      <w:r>
-        <w:t>actually implementing</w:t>
-      </w:r>
-      <w:proofErr w:type="gramEnd"/>
-      <w:r>
-        <w:t xml:space="preserve"> the model. I suggest that the authors make it very explicit where the scripts are located and how they can be used, ideally providing a simplified guide or example workflow (even if placed in an appendix or supplementary materials). While this point is briefly mentioned in the Conclusions, I feel that offering more concrete guidance would be extremely valuable. Otherwise, there is a risk that the model remains a strong theoretical contribution without being widely adopted. Facilitating implementation seems crucial if the goal is to encourage future use and extension of the model by other researchers. </w:t>
+        <w:t>The manuscript states that the FoMo framework is intended to be clear and usable by the broader community; however, the complexity of the presentation may unintentionally discourage researchers from actually implementing the model. I suggest that the authors make it very explicit where the scripts are located and how they can be used, ideally providing a simplified guide or example workflow (even if placed in an appendix or supplementary materials). While this point is briefly mentioned in the Conclusions, I feel that offering more concrete guidance would be extremely valuable. Otherwise, there is a risk that the model remains a strong theoretical contribution without being widely adopted. Facilitating implementation seems crucial if the goal is to encourage future use and extension of the model by other researchers. </w:t>
       </w:r>
     </w:p>
     <w:p/>
@@ -386,21 +244,7 @@
         <w:rPr>
           <w:color w:val="EE0000"/>
         </w:rPr>
-        <w:t xml:space="preserve">We appreciate that the model is complex. We provide a full README on the model fitting process on our </w:t>
-      </w:r>
-      <w:proofErr w:type="spellStart"/>
-      <w:r>
-        <w:rPr>
-          <w:color w:val="EE0000"/>
-        </w:rPr>
-        <w:t>Github</w:t>
-      </w:r>
-      <w:proofErr w:type="spellEnd"/>
-      <w:r>
-        <w:rPr>
-          <w:color w:val="EE0000"/>
-        </w:rPr>
-        <w:t xml:space="preserve"> (</w:t>
+        <w:t>We appreciate that the model is complex. We provide a full README on the model fitting process on our Github (</w:t>
       </w:r>
       <w:hyperlink r:id="rId8" w:history="1">
         <w:r>
@@ -442,31 +286,7 @@
     </w:p>
     <w:p>
       <w:r>
-        <w:t xml:space="preserve">On page 4, the authors discuss individual differences in visual foraging and note that </w:t>
-      </w:r>
-      <w:proofErr w:type="spellStart"/>
-      <w:r>
-        <w:t>FoMo</w:t>
-      </w:r>
-      <w:proofErr w:type="spellEnd"/>
-      <w:r>
-        <w:t xml:space="preserve"> can detect such differences, particularly in developmental contexts (lines 363–366). When discussing Marginal Value Theorem–related aspects, however, the Introduction does not note that evidence for developmental differences in MVT-related measures in humans is currently limited (e.g., Gil-Gómez de </w:t>
-      </w:r>
-      <w:proofErr w:type="spellStart"/>
-      <w:r>
-        <w:t>Liaño</w:t>
-      </w:r>
-      <w:proofErr w:type="spellEnd"/>
-      <w:r>
-        <w:t xml:space="preserve"> et al., 2022; Gil-Gómez de </w:t>
-      </w:r>
-      <w:proofErr w:type="spellStart"/>
-      <w:r>
-        <w:t>Liaño</w:t>
-      </w:r>
-      <w:proofErr w:type="spellEnd"/>
-      <w:r>
-        <w:t xml:space="preserve"> &amp; Wolfe, 2022).  As a purely optional contextual clarification, the authors could briefly mention that developmental differences are not always observed in MVT-related outcomes. This contrast may be particularly interesting given evidence that spatial organization shows developmental differences (e.g., article 56 cited in the manuscript), and that spatial organization may predict leave/stop decisions in visual foraging better than MVT, as shown in a recent work (Bella et al., 2025).  I emphasize that this is intended as a conceptual suggestion rather than a request to include specific citations. If the authors find it useful, acknowledging this contrast either in the </w:t>
+        <w:t xml:space="preserve">On page 4, the authors discuss individual differences in visual foraging and note that FoMo can detect such differences, particularly in developmental contexts (lines 363–366). When discussing Marginal Value Theorem–related aspects, however, the Introduction does not note that evidence for developmental differences in MVT-related measures in humans is currently limited (e.g., Gil-Gómez de Liaño et al., 2022; Gil-Gómez de Liaño &amp; Wolfe, 2022).  As a purely optional contextual clarification, the authors could briefly mention that developmental differences are not always observed in MVT-related outcomes. This contrast may be particularly interesting given evidence that spatial organization shows developmental differences (e.g., article 56 cited in the manuscript), and that spatial organization may predict leave/stop decisions in visual foraging better than MVT, as shown in a recent work (Bella et al., 2025).  I emphasize that this is intended as a conceptual suggestion rather than a request to include specific citations. If the authors find it useful, acknowledging this contrast either in the </w:t>
       </w:r>
       <w:r>
         <w:lastRenderedPageBreak/>
@@ -484,7 +304,19 @@
         <w:rPr>
           <w:color w:val="EE0000"/>
         </w:rPr>
-        <w:t>Thank you for your points here: we have now included references to these studies both in the introduction (L387) and the discussion (L1185).</w:t>
+        <w:t>Thank you for your points here: we have now included references to these studies both in the introduction (L387) and the discussion (L1</w:t>
+      </w:r>
+      <w:r>
+        <w:rPr>
+          <w:color w:val="EE0000"/>
+        </w:rPr>
+        <w:t>206</w:t>
+      </w:r>
+      <w:r>
+        <w:rPr>
+          <w:color w:val="EE0000"/>
+        </w:rPr>
+        <w:t>).</w:t>
       </w:r>
     </w:p>
     <w:p/>
@@ -569,15 +401,7 @@
         </w:numPr>
       </w:pPr>
       <w:r>
-        <w:t>Figure 4 caption (page 7), third line: “</w:t>
-      </w:r>
-      <w:proofErr w:type="spellStart"/>
-      <w:r>
-        <w:t>fleixbly</w:t>
-      </w:r>
-      <w:proofErr w:type="spellEnd"/>
-      <w:r>
-        <w:t>” should be corrected to “flexibly.” </w:t>
+        <w:t>Figure 4 caption (page 7), third line: “fleixbly” should be corrected to “flexibly.” </w:t>
       </w:r>
     </w:p>
     <w:p>
@@ -686,15 +510,7 @@
     </w:p>
     <w:p>
       <w:r>
-        <w:t xml:space="preserve">On page 11 (line 801), the text refers to performance being “around 50%.” While this information is reported in Table 3, I suggest adding a brief clarification such as “when chance performance is below 0.12 in all cases” (or similar wording). This additional context would make the result easier to interpret at first glance. The point is explained clearly later in the </w:t>
-      </w:r>
-      <w:proofErr w:type="gramStart"/>
-      <w:r>
-        <w:t>Discussion, but</w:t>
-      </w:r>
-      <w:proofErr w:type="gramEnd"/>
-      <w:r>
-        <w:t xml:space="preserve"> including it here would make the Results section more informative and self-contained. </w:t>
+        <w:t>On page 11 (line 801), the text refers to performance being “around 50%.” While this information is reported in Table 3, I suggest adding a brief clarification such as “when chance performance is below 0.12 in all cases” (or similar wording). This additional context would make the result easier to interpret at first glance. The point is explained clearly later in the Discussion, but including it here would make the Results section more informative and self-contained. </w:t>
       </w:r>
     </w:p>
     <w:p>
@@ -724,15 +540,7 @@
     </w:p>
     <w:p>
       <w:r>
-        <w:t xml:space="preserve">At some points in the Results section, it becomes slightly difficult to keep track of what each model variant contributes. </w:t>
-      </w:r>
-      <w:proofErr w:type="gramStart"/>
-      <w:r>
-        <w:t>In particular, Model</w:t>
-      </w:r>
-      <w:proofErr w:type="gramEnd"/>
-      <w:r>
-        <w:t xml:space="preserve"> 1.3 (arguably the best-performing model and the one that incorporates absolute direction) could be briefly reintroduced or reminded to the reader at key points throughout the section. This would help maintain clarity when interpreting the comparative results. This is a very minor suggestion, and the authors should feel free to adopt it only if they find it useful. </w:t>
+        <w:t>At some points in the Results section, it becomes slightly difficult to keep track of what each model variant contributes. In particular, Model 1.3 (arguably the best-performing model and the one that incorporates absolute direction) could be briefly reintroduced or reminded to the reader at key points throughout the section. This would help maintain clarity when interpreting the comparative results. This is a very minor suggestion, and the authors should feel free to adopt it only if they find it useful. </w:t>
       </w:r>
     </w:p>
     <w:p>
@@ -761,23 +569,7 @@
     </w:p>
     <w:p>
       <w:r>
-        <w:t xml:space="preserve">The caption of Figure 6 would benefit from additional detail. Although the main text explains the figure, it would be helpful if the caption itself included more information, particularly regarding what is being measured on the axes in the lower panels. In addition, briefly reminding the reader what parameters such as </w:t>
-      </w:r>
-      <w:proofErr w:type="spellStart"/>
-      <w:r>
-        <w:t>b_a</w:t>
-      </w:r>
-      <w:proofErr w:type="spellEnd"/>
-      <w:r>
-        <w:t xml:space="preserve">, </w:t>
-      </w:r>
-      <w:proofErr w:type="spellStart"/>
-      <w:r>
-        <w:t>b_s</w:t>
-      </w:r>
-      <w:proofErr w:type="spellEnd"/>
-      <w:r>
-        <w:t>, etc., represent in the four upper panels would improve accessibility and allow the figure to stand more independently from the text. </w:t>
+        <w:t>The caption of Figure 6 would benefit from additional detail. Although the main text explains the figure, it would be helpful if the caption itself included more information, particularly regarding what is being measured on the axes in the lower panels. In addition, briefly reminding the reader what parameters such as b_a, b_s, etc., represent in the four upper panels would improve accessibility and allow the figure to stand more independently from the text. </w:t>
       </w:r>
     </w:p>
     <w:p>
@@ -874,7 +666,19 @@
         <w:rPr>
           <w:color w:val="EE0000"/>
         </w:rPr>
-        <w:t>Thank you, we have now referred to the idea of directly manipulating search strategies in the discussion (see L1092).</w:t>
+        <w:t>Thank you, we have now referred to the idea of directly manipulating search strategies in the discussion (see L1</w:t>
+      </w:r>
+      <w:r>
+        <w:rPr>
+          <w:color w:val="EE0000"/>
+        </w:rPr>
+        <w:t>117</w:t>
+      </w:r>
+      <w:r>
+        <w:rPr>
+          <w:color w:val="EE0000"/>
+        </w:rPr>
+        <w:t>).</w:t>
       </w:r>
     </w:p>
     <w:p/>
@@ -898,35 +702,19 @@
         <w:rPr>
           <w:color w:val="EE0000"/>
         </w:rPr>
-        <w:t xml:space="preserve">Thank you for this suggestion: we agree that considering dynamic and more realistic environments is an important future goal for </w:t>
-      </w:r>
-      <w:proofErr w:type="spellStart"/>
-      <w:r>
-        <w:rPr>
-          <w:color w:val="EE0000"/>
-        </w:rPr>
-        <w:t>FoMo</w:t>
-      </w:r>
-      <w:proofErr w:type="spellEnd"/>
-      <w:r>
-        <w:rPr>
-          <w:color w:val="EE0000"/>
-        </w:rPr>
-        <w:t xml:space="preserve"> (and is also something raised by R1). We have added a paragraph to the end of the discussion highlighting this (L1186), as well as referring to one of our recent pre-prints which is an initial attempt to apply a version of </w:t>
-      </w:r>
-      <w:proofErr w:type="spellStart"/>
-      <w:r>
-        <w:rPr>
-          <w:color w:val="EE0000"/>
-        </w:rPr>
-        <w:t>FoMo</w:t>
-      </w:r>
-      <w:proofErr w:type="spellEnd"/>
-      <w:r>
-        <w:rPr>
-          <w:color w:val="EE0000"/>
-        </w:rPr>
-        <w:t xml:space="preserve"> to a (very simple) more realistic foraging experiment. We look forward to being able to develop these ideas as more secondary datasets become available.</w:t>
+        <w:t>Thank you for this suggestion: we agree that considering dynamic and more realistic environments is an important future goal for FoMo (and is also something raised by R1). We have added a paragraph to the end of the discussion highlighting this (L1</w:t>
+      </w:r>
+      <w:r>
+        <w:rPr>
+          <w:color w:val="EE0000"/>
+        </w:rPr>
+        <w:t>210</w:t>
+      </w:r>
+      <w:r>
+        <w:rPr>
+          <w:color w:val="EE0000"/>
+        </w:rPr>
+        <w:t>), as well as referring to one of our recent pre-prints which is an initial attempt to apply a version of FoMo to a (very simple) more realistic foraging experiment. We look forward to being able to develop these ideas as more secondary datasets become available.</w:t>
       </w:r>
     </w:p>
     <w:p/>
@@ -968,49 +756,17 @@
     </w:p>
     <w:p>
       <w:r>
-        <w:t xml:space="preserve">Bella-Fernández, M., Suero Suñé, M., Ferrer-Mendieta, A., Gil-Gómez de </w:t>
-      </w:r>
-      <w:proofErr w:type="spellStart"/>
-      <w:r>
-        <w:t>Liaño</w:t>
-      </w:r>
-      <w:proofErr w:type="spellEnd"/>
-      <w:r>
-        <w:t xml:space="preserve">, B. (2025). One factor to bind them all: visual foraging organization to predict patch leaving </w:t>
-      </w:r>
-      <w:proofErr w:type="spellStart"/>
-      <w:r>
-        <w:t>behavior</w:t>
-      </w:r>
-      <w:proofErr w:type="spellEnd"/>
-      <w:r>
-        <w:t xml:space="preserve"> with ROC curves. Cognitive Research: Principles &amp; Implications, 10, 16. https://doi.org/10.1186/s41235-025-00624-7 </w:t>
-      </w:r>
-    </w:p>
-    <w:p>
-      <w:r>
-        <w:t xml:space="preserve">Gil-Gómez de </w:t>
-      </w:r>
-      <w:proofErr w:type="spellStart"/>
-      <w:r>
-        <w:t>Liaño</w:t>
-      </w:r>
-      <w:proofErr w:type="spellEnd"/>
-      <w:r>
-        <w:t>, B., Muñoz-García, A., Perez-Hernandez, E., &amp; Wolfe, J. M. (2022). Quitting rules in hybrid foraging search: From early childhood to early adulthood. Cognitive Development, 64, 1-14. https://doi.org/10.1016/j.cogdev.2022.101232 </w:t>
-      </w:r>
-    </w:p>
-    <w:p>
-      <w:r>
-        <w:t xml:space="preserve">Gil-Gómez de </w:t>
-      </w:r>
-      <w:proofErr w:type="spellStart"/>
-      <w:r>
-        <w:t>Liaño</w:t>
-      </w:r>
-      <w:proofErr w:type="spellEnd"/>
-      <w:r>
-        <w:t>, B. &amp; Wolfe, J. M. (2022). The FORAGEKID Game: Hybrid-Foraging as a new way to study aspects of executive function in development. Cognitive Development, 64, 1-14. https://doi.org/10.1016/j.cogdev.2022.101233 </w:t>
+        <w:t>Bella-Fernández, M., Suero Suñé, M., Ferrer-Mendieta, A., Gil-Gómez de Liaño, B. (2025). One factor to bind them all: visual foraging organization to predict patch leaving behavior with ROC curves. Cognitive Research: Principles &amp; Implications, 10, 16. https://doi.org/10.1186/s41235-025-00624-7 </w:t>
+      </w:r>
+    </w:p>
+    <w:p>
+      <w:r>
+        <w:t>Gil-Gómez de Liaño, B., Muñoz-García, A., Perez-Hernandez, E., &amp; Wolfe, J. M. (2022). Quitting rules in hybrid foraging search: From early childhood to early adulthood. Cognitive Development, 64, 1-14. https://doi.org/10.1016/j.cogdev.2022.101232 </w:t>
+      </w:r>
+    </w:p>
+    <w:p>
+      <w:r>
+        <w:t>Gil-Gómez de Liaño, B. &amp; Wolfe, J. M. (2022). The FORAGEKID Game: Hybrid-Foraging as a new way to study aspects of executive function in development. Cognitive Development, 64, 1-14. https://doi.org/10.1016/j.cogdev.2022.101233 </w:t>
       </w:r>
     </w:p>
     <w:p>
@@ -1026,23 +782,7 @@
     </w:p>
     <w:p>
       <w:r>
-        <w:t xml:space="preserve">This is an interesting paper describing the next version of the authors’ </w:t>
-      </w:r>
-      <w:proofErr w:type="spellStart"/>
-      <w:r>
-        <w:t>FoMo</w:t>
-      </w:r>
-      <w:proofErr w:type="spellEnd"/>
-      <w:r>
-        <w:t xml:space="preserve"> (Foraging Model). Version 1.3 includes a directional component that helps in the prediction of what item gets picked next in a foraging task. The model does a very decent job of predicting </w:t>
-      </w:r>
-      <w:proofErr w:type="spellStart"/>
-      <w:r>
-        <w:t>behavior</w:t>
-      </w:r>
-      <w:proofErr w:type="spellEnd"/>
-      <w:r>
-        <w:t xml:space="preserve"> in several datasets. Someone other than me should vouch for the computational details of the model but it looks solid to me.</w:t>
+        <w:t>This is an interesting paper describing the next version of the authors’ FoMo (Foraging Model). Version 1.3 includes a directional component that helps in the prediction of what item gets picked next in a foraging task. The model does a very decent job of predicting behavior in several datasets. Someone other than me should vouch for the computational details of the model but it looks solid to me.</w:t>
       </w:r>
       <w:r>
         <w:br/>
@@ -1056,135 +796,27 @@
       </w:r>
       <w:r>
         <w:br/>
-        <w:t xml:space="preserve">1) My main concern is that </w:t>
-      </w:r>
-      <w:proofErr w:type="spellStart"/>
-      <w:r>
-        <w:t>FoMo</w:t>
-      </w:r>
-      <w:proofErr w:type="spellEnd"/>
-      <w:r>
-        <w:t xml:space="preserve"> is, at present, a big hammer that is hitting a rather small nail. There is a lot of </w:t>
-      </w:r>
-      <w:proofErr w:type="spellStart"/>
-      <w:r>
-        <w:t>modeling</w:t>
-      </w:r>
-      <w:proofErr w:type="spellEnd"/>
-      <w:r>
-        <w:t xml:space="preserve"> here for purposes of explaining a rather restricted set of data. </w:t>
-      </w:r>
-      <w:proofErr w:type="spellStart"/>
-      <w:r>
-        <w:t>FoMo</w:t>
-      </w:r>
-      <w:proofErr w:type="spellEnd"/>
-      <w:r>
-        <w:t xml:space="preserve"> “currently assumes exhaustive foraging”. This is fine for </w:t>
-      </w:r>
-      <w:proofErr w:type="spellStart"/>
-      <w:r>
-        <w:t>analyzing</w:t>
-      </w:r>
-      <w:proofErr w:type="spellEnd"/>
-      <w:r>
-        <w:t xml:space="preserve"> Kristjansson-style data where </w:t>
-      </w:r>
-      <w:proofErr w:type="spellStart"/>
-      <w:r>
-        <w:t>Os</w:t>
-      </w:r>
-      <w:proofErr w:type="spellEnd"/>
-      <w:r>
-        <w:t xml:space="preserve"> are instructed to search exhaustively for two types of </w:t>
-      </w:r>
-      <w:proofErr w:type="gramStart"/>
-      <w:r>
-        <w:t>target</w:t>
-      </w:r>
-      <w:proofErr w:type="gramEnd"/>
-      <w:r>
-        <w:t xml:space="preserve">. I suspect that non-exhaustive foraging is much less systematic and, indeed, apparently </w:t>
-      </w:r>
-      <w:proofErr w:type="spellStart"/>
-      <w:r>
-        <w:t>FoMo</w:t>
-      </w:r>
-      <w:proofErr w:type="spellEnd"/>
-      <w:r>
-        <w:t xml:space="preserve"> does not do as well with the Tagu data which (I gather) is non-exhaustive. So, I worry if </w:t>
-      </w:r>
-      <w:proofErr w:type="spellStart"/>
-      <w:r>
-        <w:t>FoMo</w:t>
-      </w:r>
-      <w:proofErr w:type="spellEnd"/>
-      <w:r>
-        <w:t xml:space="preserve"> might be a lot of </w:t>
-      </w:r>
-      <w:proofErr w:type="gramStart"/>
-      <w:r>
-        <w:t>model</w:t>
-      </w:r>
-      <w:proofErr w:type="gramEnd"/>
-      <w:r>
-        <w:t xml:space="preserve"> for showing that </w:t>
-      </w:r>
-      <w:proofErr w:type="spellStart"/>
-      <w:r>
-        <w:t>Os</w:t>
-      </w:r>
-      <w:proofErr w:type="spellEnd"/>
-      <w:r>
-        <w:t xml:space="preserve"> tend to search very systematically when forced to find everything.</w:t>
-      </w:r>
-    </w:p>
-    <w:p>
-      <w:pPr>
-        <w:rPr>
-          <w:color w:val="EE0000"/>
-        </w:rPr>
-      </w:pPr>
-      <w:r>
-        <w:rPr>
-          <w:color w:val="EE0000"/>
-        </w:rPr>
-        <w:t xml:space="preserve">We agree that one of the current limitations of </w:t>
-      </w:r>
-      <w:proofErr w:type="spellStart"/>
-      <w:r>
-        <w:rPr>
-          <w:color w:val="EE0000"/>
-        </w:rPr>
-        <w:t>FoMo</w:t>
-      </w:r>
-      <w:proofErr w:type="spellEnd"/>
-      <w:r>
-        <w:rPr>
-          <w:color w:val="EE0000"/>
-        </w:rPr>
-        <w:t xml:space="preserve"> is that it is largely optimised for exhaustive foraging, although it is a little unclear whether that is the key limitation for the Tagu dataset (there are a number of slightly different things about it, including the value-no value manipulation, and the fact that we have collapsed the number of target </w:t>
+        <w:t>1) My main concern is that FoMo is, at present, a big hammer that is hitting a rather small nail. There is a lot of modeling here for purposes of explaining a rather restricted set of data. FoMo “currently assumes exhaustive foraging”. This is fine for analyzing Kristjansson-style data where Os are instructed to search exhaustively for two types of target. I suspect that non-exhaustive foraging is much less systematic and, indeed, apparently FoMo does not do as well with the Tagu data which (I gather) is non-exhaustive. So, I worry if FoMo might be a lot of model for showing that Os tend to search very systematically when forced to find everything.</w:t>
+      </w:r>
+    </w:p>
+    <w:p>
+      <w:pPr>
+        <w:rPr>
+          <w:color w:val="EE0000"/>
+        </w:rPr>
+      </w:pPr>
+      <w:r>
+        <w:rPr>
+          <w:color w:val="EE0000"/>
+        </w:rPr>
+        <w:t xml:space="preserve">We agree that one of the current limitations of FoMo is that it is largely optimised for exhaustive foraging, although it is a little unclear whether that is the key limitation for the Tagu dataset (there are a number of slightly different things about it, including the value-no value manipulation, and the fact that we have collapsed the number of target </w:t>
       </w:r>
       <w:r>
         <w:rPr>
           <w:color w:val="EE0000"/>
         </w:rPr>
         <w:lastRenderedPageBreak/>
-        <w:t xml:space="preserve">categories - in the ‘low value’ condition there were actually several colours of target possible, but at present, </w:t>
-      </w:r>
-      <w:proofErr w:type="spellStart"/>
-      <w:r>
-        <w:rPr>
-          <w:color w:val="EE0000"/>
-        </w:rPr>
-        <w:t>FoMo</w:t>
-      </w:r>
-      <w:proofErr w:type="spellEnd"/>
-      <w:r>
-        <w:rPr>
-          <w:color w:val="EE0000"/>
-        </w:rPr>
-        <w:t xml:space="preserve"> only works with two target categories - though see below!) In general, we have taken the approach of trying to develop a robust framework that we then extend to be able to tackle more general problems. As mentioned in our response to R1, we are beginning to get work uploaded to pre-print servers e.g. work led by our PhD student (</w:t>
+        <w:t>categories - in the ‘low value’ condition there were actually several colours of target possible, but at present, FoMo only works with two target categories - though see below!) In general, we have taken the approach of trying to develop a robust framework that we then extend to be able to tackle more general problems. As mentioned in our response to R1, we are beginning to get work uploaded to pre-print servers e.g. work led by our PhD student (</w:t>
       </w:r>
       <w:hyperlink r:id="rId9" w:history="1">
         <w:r>
@@ -1199,35 +831,13 @@
         <w:rPr>
           <w:color w:val="EE0000"/>
         </w:rPr>
-        <w:t xml:space="preserve">) that shows that </w:t>
-      </w:r>
-      <w:proofErr w:type="spellStart"/>
-      <w:r>
-        <w:rPr>
-          <w:color w:val="EE0000"/>
-        </w:rPr>
-        <w:t>FoMo</w:t>
-      </w:r>
-      <w:proofErr w:type="spellEnd"/>
-      <w:r>
-        <w:rPr>
-          <w:color w:val="EE0000"/>
-        </w:rPr>
-        <w:t xml:space="preserve"> is applicable to domains beyond Kristjansson style tasks.</w:t>
-      </w:r>
-    </w:p>
-    <w:p>
-      <w:r>
-        <w:br/>
-        <w:t xml:space="preserve">2) At the very least, you should be saying more about the distinction between exhaustive and non-exhaustive search tasks. For instance, in section 2.5, you should be more explicit about the instructions in the tasks that are being </w:t>
-      </w:r>
-      <w:proofErr w:type="spellStart"/>
-      <w:r>
-        <w:t>modeled</w:t>
-      </w:r>
-      <w:proofErr w:type="spellEnd"/>
-      <w:r>
-        <w:t xml:space="preserve"> I don’t think you mention that the Tagu task is non-exhaustive. That point comes up later.</w:t>
+        <w:t>) that shows that FoMo is applicable to domains beyond Kristjansson style tasks.</w:t>
+      </w:r>
+    </w:p>
+    <w:p>
+      <w:r>
+        <w:br/>
+        <w:t>2) At the very least, you should be saying more about the distinction between exhaustive and non-exhaustive search tasks. For instance, in section 2.5, you should be more explicit about the instructions in the tasks that are being modeled I don’t think you mention that the Tagu task is non-exhaustive. That point comes up later.</w:t>
       </w:r>
     </w:p>
     <w:p>
@@ -1245,31 +855,7 @@
     </w:p>
     <w:p>
       <w:r>
-        <w:t xml:space="preserve">3) Switching </w:t>
-      </w:r>
-      <w:proofErr w:type="spellStart"/>
-      <w:r>
-        <w:t>behavior</w:t>
-      </w:r>
-      <w:proofErr w:type="spellEnd"/>
-      <w:r>
-        <w:t xml:space="preserve"> is also quite different (I think) in non-exhaustive foraging: e.g. Wolfe, J. M., Cain, M. S., &amp; </w:t>
-      </w:r>
-      <w:proofErr w:type="spellStart"/>
-      <w:r>
-        <w:t>Aizenman</w:t>
-      </w:r>
-      <w:proofErr w:type="spellEnd"/>
-      <w:r>
-        <w:t xml:space="preserve">, A. M. (2019). Guidance and selection history in hybrid foraging visual search [journal article]. Atten Percept </w:t>
-      </w:r>
-      <w:proofErr w:type="spellStart"/>
-      <w:r>
-        <w:t>Psychophys</w:t>
-      </w:r>
-      <w:proofErr w:type="spellEnd"/>
-      <w:r>
-        <w:t xml:space="preserve">, 81(3), 637-653. </w:t>
+        <w:t xml:space="preserve">3) Switching behavior is also quite different (I think) in non-exhaustive foraging: e.g. Wolfe, J. M., Cain, M. S., &amp; Aizenman, A. M. (2019). Guidance and selection history in hybrid foraging visual search [journal article]. Atten Percept Psychophys, 81(3), 637-653. </w:t>
       </w:r>
       <w:hyperlink r:id="rId10" w:history="1">
         <w:r>
@@ -1290,56 +876,7 @@
         <w:rPr>
           <w:color w:val="EE0000"/>
         </w:rPr>
-        <w:t xml:space="preserve">We are </w:t>
-      </w:r>
-      <w:proofErr w:type="gramStart"/>
-      <w:r>
-        <w:rPr>
-          <w:color w:val="EE0000"/>
-        </w:rPr>
-        <w:t>actually working</w:t>
-      </w:r>
-      <w:proofErr w:type="gramEnd"/>
-      <w:r>
-        <w:rPr>
-          <w:color w:val="EE0000"/>
-        </w:rPr>
-        <w:t xml:space="preserve"> on extensions to </w:t>
-      </w:r>
-      <w:proofErr w:type="spellStart"/>
-      <w:r>
-        <w:rPr>
-          <w:color w:val="EE0000"/>
-        </w:rPr>
-        <w:t>FoMo</w:t>
-      </w:r>
-      <w:proofErr w:type="spellEnd"/>
-      <w:r>
-        <w:rPr>
-          <w:color w:val="EE0000"/>
-        </w:rPr>
-        <w:t xml:space="preserve"> that predict patch-leaving behaviour </w:t>
-      </w:r>
-      <w:proofErr w:type="gramStart"/>
-      <w:r>
-        <w:rPr>
-          <w:color w:val="EE0000"/>
-        </w:rPr>
-        <w:t>at the moment</w:t>
-      </w:r>
-      <w:proofErr w:type="gramEnd"/>
-      <w:r>
-        <w:rPr>
-          <w:color w:val="EE0000"/>
-        </w:rPr>
-        <w:t xml:space="preserve">, and we would be very excited to collaborate with </w:t>
-      </w:r>
-      <w:proofErr w:type="gramStart"/>
-      <w:r>
-        <w:rPr>
-          <w:color w:val="EE0000"/>
-        </w:rPr>
-        <w:t>you</w:t>
+        <w:t>We are actually working on extensions to FoMo that predict patch-leaving behaviour at the moment, and we would be very excited to collaborate with you</w:t>
       </w:r>
       <w:r>
         <w:rPr>
@@ -1351,42 +888,7 @@
         <w:rPr>
           <w:color w:val="EE0000"/>
         </w:rPr>
-        <w:t xml:space="preserve"> on</w:t>
-      </w:r>
-      <w:proofErr w:type="gramEnd"/>
-      <w:r>
-        <w:rPr>
-          <w:color w:val="EE0000"/>
-        </w:rPr>
-        <w:t xml:space="preserve"> being able to access data such as that from your paper above to help test how well </w:t>
-      </w:r>
-      <w:proofErr w:type="spellStart"/>
-      <w:r>
-        <w:rPr>
-          <w:color w:val="EE0000"/>
-        </w:rPr>
-        <w:t>FoMo</w:t>
-      </w:r>
-      <w:proofErr w:type="spellEnd"/>
-      <w:r>
-        <w:rPr>
-          <w:color w:val="EE0000"/>
-        </w:rPr>
-        <w:t xml:space="preserve"> can perform when trying to model these tasks. As discussed above, we are trying to build up the model slowly </w:t>
-      </w:r>
-      <w:proofErr w:type="gramStart"/>
-      <w:r>
-        <w:rPr>
-          <w:color w:val="EE0000"/>
-        </w:rPr>
-        <w:t>in order to</w:t>
-      </w:r>
-      <w:proofErr w:type="gramEnd"/>
-      <w:r>
-        <w:rPr>
-          <w:color w:val="EE0000"/>
-        </w:rPr>
-        <w:t xml:space="preserve"> be able to test it rigorously, and therefore we intend for questions around patch-leaving to be a separate strand of work.</w:t>
+        <w:t xml:space="preserve"> on being able to access data such as that from your paper above to help test how well FoMo can perform when trying to model these tasks. As discussed above, we are trying to build up the model slowly in order to be able to test it rigorously, and therefore we intend for questions around patch-leaving to be a separate strand of work.</w:t>
       </w:r>
     </w:p>
     <w:p>
@@ -1405,60 +907,14 @@
         <w:rPr>
           <w:color w:val="EE0000"/>
         </w:rPr>
-        <w:t xml:space="preserve">This is also an area we are actively working on - theoretically, it is a relatively straightforward extension, involving building in transition matrices for different types of </w:t>
-      </w:r>
-      <w:proofErr w:type="gramStart"/>
-      <w:r>
-        <w:rPr>
-          <w:color w:val="EE0000"/>
-        </w:rPr>
-        <w:t>switch</w:t>
-      </w:r>
-      <w:proofErr w:type="gramEnd"/>
-      <w:r>
-        <w:rPr>
-          <w:color w:val="EE0000"/>
-        </w:rPr>
-        <w:t xml:space="preserve"> (A-B, B-C, C-A etc.)  Again, we would be delighted to be able to test out how well it works on your data (we can’t currently see an open-source version of the data for the paper above, but please do let us know if we’ve missed something).</w:t>
-      </w:r>
-      <w:r>
-        <w:br/>
-      </w:r>
-      <w:r>
-        <w:br/>
-        <w:t xml:space="preserve">5) I wonder how well a really simple nearest </w:t>
-      </w:r>
-      <w:proofErr w:type="spellStart"/>
-      <w:r>
-        <w:t>neighbor</w:t>
-      </w:r>
-      <w:proofErr w:type="spellEnd"/>
-      <w:r>
-        <w:t xml:space="preserve"> model do with standard Kristjansson data? Such a model would have a switch probability (low for </w:t>
-      </w:r>
-      <w:proofErr w:type="spellStart"/>
-      <w:r>
-        <w:t>conj</w:t>
-      </w:r>
-      <w:proofErr w:type="spellEnd"/>
-      <w:r>
-        <w:t xml:space="preserve">, higher for feature) and then just a simple nearest </w:t>
-      </w:r>
-      <w:proofErr w:type="spellStart"/>
-      <w:r>
-        <w:t>neighbor</w:t>
-      </w:r>
-      <w:proofErr w:type="spellEnd"/>
-      <w:r>
-        <w:t xml:space="preserve"> rule. That might be a nice benchmark to show how </w:t>
-      </w:r>
-      <w:proofErr w:type="spellStart"/>
-      <w:r>
-        <w:t>FoMo</w:t>
-      </w:r>
-      <w:proofErr w:type="spellEnd"/>
-      <w:r>
-        <w:t xml:space="preserve"> can do.</w:t>
+        <w:t>This is also an area we are actively working on - theoretically, it is a relatively straightforward extension, involving building in transition matrices for different types of switch (A-B, B-C, C-A etc.)  Again, we would be delighted to be able to test out how well it works on your data (we can’t currently see an open-source version of the data for the paper above, but please do let us know if we’ve missed something).</w:t>
+      </w:r>
+      <w:r>
+        <w:br/>
+      </w:r>
+      <w:r>
+        <w:br/>
+        <w:t>5) I wonder how well a really simple nearest neighbor model do with standard Kristjansson data? Such a model would have a switch probability (low for conj, higher for feature) and then just a simple nearest neighbor rule. That might be a nice benchmark to show how FoMo can do.</w:t>
       </w:r>
     </w:p>
     <w:p>
@@ -1467,21 +923,7 @@
           <w:color w:val="EE0000"/>
         </w:rPr>
         <w:lastRenderedPageBreak/>
-        <w:t xml:space="preserve">This is a </w:t>
-      </w:r>
-      <w:proofErr w:type="gramStart"/>
-      <w:r>
-        <w:rPr>
-          <w:color w:val="EE0000"/>
-        </w:rPr>
-        <w:t>really great</w:t>
-      </w:r>
-      <w:proofErr w:type="gramEnd"/>
-      <w:r>
-        <w:rPr>
-          <w:color w:val="EE0000"/>
-        </w:rPr>
-        <w:t xml:space="preserve"> point and is something we have implemented in </w:t>
+        <w:t xml:space="preserve">This is a really great point and is something we have implemented in </w:t>
       </w:r>
       <w:hyperlink r:id="rId11" w:history="1">
         <w:r>
@@ -1496,21 +938,7 @@
         <w:rPr>
           <w:color w:val="EE0000"/>
         </w:rPr>
-        <w:t xml:space="preserve">. In brief, a nearest neighbour model does seem to work well in that task (which is even simpler than Kristjansson-style foraging, as there is only one target type) but </w:t>
-      </w:r>
-      <w:proofErr w:type="spellStart"/>
-      <w:r>
-        <w:rPr>
-          <w:color w:val="EE0000"/>
-        </w:rPr>
-        <w:t>FoMo</w:t>
-      </w:r>
-      <w:proofErr w:type="spellEnd"/>
-      <w:r>
-        <w:rPr>
-          <w:color w:val="EE0000"/>
-        </w:rPr>
-        <w:t xml:space="preserve"> can still outperform it when using a slightly altered decision rule (essentially choosing the target with the maximum weighting). </w:t>
+        <w:t xml:space="preserve">. In brief, a nearest neighbour model does seem to work well in that task (which is even simpler than Kristjansson-style foraging, as there is only one target type) but FoMo can still outperform it when using a slightly altered decision rule (essentially choosing the target with the maximum weighting). </w:t>
       </w:r>
       <w:r>
         <w:br/>
@@ -1583,23 +1011,7 @@
     <w:p>
       <w:r>
         <w:br/>
-        <w:t xml:space="preserve">9) For the </w:t>
-      </w:r>
-      <w:proofErr w:type="spellStart"/>
-      <w:r>
-        <w:t>FoMo</w:t>
-      </w:r>
-      <w:proofErr w:type="spellEnd"/>
-      <w:r>
-        <w:t xml:space="preserve"> description, I would add a table of terms as an appendix or something. I can’t keep them in memory. (b(a), b(s)</w:t>
-      </w:r>
-      <w:proofErr w:type="gramStart"/>
-      <w:r>
-        <w:t>….etc</w:t>
-      </w:r>
-      <w:proofErr w:type="gramEnd"/>
-      <w:r>
-        <w:t>)</w:t>
+        <w:t>9) For the FoMo description, I would add a table of terms as an appendix or something. I can’t keep them in memory. (b(a), b(s)….etc)</w:t>
       </w:r>
     </w:p>
     <w:p>
@@ -1608,21 +1020,7 @@
           <w:color w:val="EE0000"/>
         </w:rPr>
         <w:lastRenderedPageBreak/>
-        <w:t xml:space="preserve">We have now included Table 1, which is an overview of notation used to define </w:t>
-      </w:r>
-      <w:proofErr w:type="spellStart"/>
-      <w:r>
-        <w:rPr>
-          <w:color w:val="EE0000"/>
-        </w:rPr>
-        <w:t>FoMo</w:t>
-      </w:r>
-      <w:proofErr w:type="spellEnd"/>
-      <w:r>
-        <w:rPr>
-          <w:color w:val="EE0000"/>
-        </w:rPr>
-        <w:t>, which we hope aids model understanding.</w:t>
+        <w:t>We have now included Table 1, which is an overview of notation used to define FoMo, which we hope aids model understanding.</w:t>
       </w:r>
       <w:r>
         <w:br/>
@@ -1656,69 +1054,17 @@
         <w:rPr>
           <w:color w:val="EE0000"/>
         </w:rPr>
-        <w:t xml:space="preserve">Apologies, you’re </w:t>
-      </w:r>
-      <w:proofErr w:type="gramStart"/>
-      <w:r>
-        <w:rPr>
-          <w:color w:val="EE0000"/>
-        </w:rPr>
-        <w:t>absolutely right</w:t>
-      </w:r>
-      <w:proofErr w:type="gramEnd"/>
-      <w:r>
-        <w:rPr>
-          <w:color w:val="EE0000"/>
-        </w:rPr>
-        <w:t xml:space="preserve"> - we meant the top left </w:t>
-      </w:r>
-      <w:proofErr w:type="gramStart"/>
-      <w:r>
-        <w:rPr>
-          <w:color w:val="EE0000"/>
-        </w:rPr>
-        <w:t>corner</w:t>
-      </w:r>
-      <w:proofErr w:type="gramEnd"/>
-      <w:r>
-        <w:rPr>
-          <w:color w:val="EE0000"/>
-        </w:rPr>
-        <w:t xml:space="preserve"> and this has now been corrected.</w:t>
-      </w:r>
-      <w:r>
-        <w:rPr>
-          <w:color w:val="EE0000"/>
-        </w:rPr>
-        <w:br/>
-      </w:r>
-      <w:r>
-        <w:br/>
-        <w:t xml:space="preserve">In sum, the </w:t>
-      </w:r>
-      <w:proofErr w:type="spellStart"/>
-      <w:r>
-        <w:t>FoMo</w:t>
-      </w:r>
-      <w:proofErr w:type="spellEnd"/>
-      <w:r>
-        <w:t xml:space="preserve"> project is a good and rigorous one. I think the current version is a bit limited in its scope. I hope that FoMo2 predicts quitting times, for example. Nevertheless, </w:t>
-      </w:r>
-      <w:proofErr w:type="spellStart"/>
-      <w:r>
-        <w:t>FoMo</w:t>
-      </w:r>
-      <w:proofErr w:type="spellEnd"/>
-      <w:r>
-        <w:t xml:space="preserve"> represents one of the best efforts to formally model human foraging </w:t>
-      </w:r>
-      <w:proofErr w:type="spellStart"/>
-      <w:r>
-        <w:t>behavior</w:t>
-      </w:r>
-      <w:proofErr w:type="spellEnd"/>
-      <w:r>
-        <w:t>.</w:t>
+        <w:t>Apologies, you’re absolutely right - we meant the top left corner and this has now been corrected.</w:t>
+      </w:r>
+      <w:r>
+        <w:rPr>
+          <w:color w:val="EE0000"/>
+        </w:rPr>
+        <w:br/>
+      </w:r>
+      <w:r>
+        <w:br/>
+        <w:t>In sum, the FoMo project is a good and rigorous one. I think the current version is a bit limited in its scope. I hope that FoMo2 predicts quitting times, for example. Nevertheless, FoMo represents one of the best efforts to formally model human foraging behavior.</w:t>
       </w:r>
       <w:r>
         <w:br/>
@@ -2955,6 +2301,7 @@
   <w:style w:type="character" w:default="1" w:styleId="DefaultParagraphFont">
     <w:name w:val="Default Paragraph Font"/>
     <w:uiPriority w:val="1"/>
+    <w:semiHidden/>
     <w:unhideWhenUsed/>
   </w:style>
   <w:style w:type="table" w:default="1" w:styleId="TableNormal">

</xml_diff>

<commit_message>
even more tidying up
</commit_message>
<xml_diff>
--- a/paper_drafts/response_to_reviewers.docx
+++ b/paper_drafts/response_to_reviewers.docx
@@ -119,7 +119,13 @@
         <w:rPr>
           <w:color w:val="EE0000"/>
         </w:rPr>
-        <w:t>210</w:t>
+        <w:t>21</w:t>
+      </w:r>
+      <w:r>
+        <w:rPr>
+          <w:color w:val="EE0000"/>
+        </w:rPr>
+        <w:t>1</w:t>
       </w:r>
       <w:r>
         <w:rPr>
@@ -259,7 +265,19 @@
         <w:rPr>
           <w:color w:val="EE0000"/>
         </w:rPr>
-        <w:t>) as well as example scripts: we now highlight this more clearly on L827.</w:t>
+        <w:t>) as well as example scripts: we now highlight this more clearly on L82</w:t>
+      </w:r>
+      <w:r>
+        <w:rPr>
+          <w:color w:val="EE0000"/>
+        </w:rPr>
+        <w:t>8</w:t>
+      </w:r>
+      <w:r>
+        <w:rPr>
+          <w:color w:val="EE0000"/>
+        </w:rPr>
+        <w:t>.</w:t>
       </w:r>
     </w:p>
     <w:p/>
@@ -310,7 +328,13 @@
         <w:rPr>
           <w:color w:val="EE0000"/>
         </w:rPr>
-        <w:t>206</w:t>
+        <w:t>2</w:t>
+      </w:r>
+      <w:r>
+        <w:rPr>
+          <w:color w:val="EE0000"/>
+        </w:rPr>
+        <w:t>10</w:t>
       </w:r>
       <w:r>
         <w:rPr>
@@ -672,7 +696,13 @@
         <w:rPr>
           <w:color w:val="EE0000"/>
         </w:rPr>
-        <w:t>117</w:t>
+        <w:t>11</w:t>
+      </w:r>
+      <w:r>
+        <w:rPr>
+          <w:color w:val="EE0000"/>
+        </w:rPr>
+        <w:t>8</w:t>
       </w:r>
       <w:r>
         <w:rPr>
@@ -708,7 +738,13 @@
         <w:rPr>
           <w:color w:val="EE0000"/>
         </w:rPr>
-        <w:t>210</w:t>
+        <w:t>21</w:t>
+      </w:r>
+      <w:r>
+        <w:rPr>
+          <w:color w:val="EE0000"/>
+        </w:rPr>
+        <w:t>1</w:t>
       </w:r>
       <w:r>
         <w:rPr>

</xml_diff>